<commit_message>
docs: finalise M4 acceptance assessment
</commit_message>
<xml_diff>
--- a/Milestone_4/M4_Data_and_Acceptance_ClosureFinal.docx
+++ b/Milestone_4/M4_Data_and_Acceptance_ClosureFinal.docx
@@ -67,6 +67,7 @@
         <w:gridCol w:w="1512"/>
         <w:gridCol w:w="936"/>
         <w:gridCol w:w="1584"/>
+        <w:gridCol w:w="1656"/>
       </w:tblGrid>
       <w:tr>
         <w:trPr>
@@ -74,7 +75,7 @@
         </w:trPr>
         <w:tc>
           <w:tcPr>
-            <w:tcW w:type="dxa" w:w="2376"/>
+            <w:tcW w:type="dxa" w:w="2304"/>
             <w:shd w:fill="183746"/>
             <w:vAlign w:val="center"/>
           </w:tcPr>
@@ -86,7 +87,7 @@
         </w:tc>
         <w:tc>
           <w:tcPr>
-            <w:tcW w:type="dxa" w:w="1008"/>
+            <w:tcW w:type="dxa" w:w="835"/>
             <w:shd w:fill="183746"/>
             <w:vAlign w:val="center"/>
           </w:tcPr>
@@ -98,7 +99,7 @@
         </w:tc>
         <w:tc>
           <w:tcPr>
-            <w:tcW w:type="dxa" w:w="864"/>
+            <w:tcW w:type="dxa" w:w="691"/>
             <w:shd w:fill="183746"/>
             <w:vAlign w:val="center"/>
           </w:tcPr>
@@ -110,7 +111,7 @@
         </w:tc>
         <w:tc>
           <w:tcPr>
-            <w:tcW w:type="dxa" w:w="1512"/>
+            <w:tcW w:type="dxa" w:w="1123"/>
             <w:shd w:fill="183746"/>
             <w:vAlign w:val="center"/>
           </w:tcPr>
@@ -122,7 +123,7 @@
         </w:tc>
         <w:tc>
           <w:tcPr>
-            <w:tcW w:type="dxa" w:w="936"/>
+            <w:tcW w:type="dxa" w:w="792"/>
             <w:shd w:fill="183746"/>
             <w:vAlign w:val="center"/>
           </w:tcPr>
@@ -134,13 +135,23 @@
         </w:tc>
         <w:tc>
           <w:tcPr>
-            <w:tcW w:type="dxa" w:w="1584"/>
+            <w:tcW w:type="dxa" w:w="1152"/>
             <w:shd w:fill="183746"/>
             <w:vAlign w:val="center"/>
           </w:tcPr>
           <w:p>
             <w:r>
-              <w:t>Fully met</w:t>
+              <w:t>Fully met (%)</w:t>
+            </w:r>
+          </w:p>
+        </w:tc>
+        <w:tc>
+          <w:tcPr>
+            <w:tcW w:type="dxa" w:w="1368"/>
+          </w:tcPr>
+          <w:p>
+            <w:r>
+              <w:t>Weighted completion</w:t>
             </w:r>
           </w:p>
         </w:tc>
@@ -151,7 +162,7 @@
         </w:trPr>
         <w:tc>
           <w:tcPr>
-            <w:tcW w:type="dxa" w:w="2376"/>
+            <w:tcW w:type="dxa" w:w="2304"/>
             <w:vAlign w:val="center"/>
           </w:tcPr>
           <w:p>
@@ -162,7 +173,7 @@
         </w:tc>
         <w:tc>
           <w:tcPr>
-            <w:tcW w:type="dxa" w:w="1008"/>
+            <w:tcW w:type="dxa" w:w="835"/>
             <w:vAlign w:val="center"/>
           </w:tcPr>
           <w:p>
@@ -173,7 +184,7 @@
         </w:tc>
         <w:tc>
           <w:tcPr>
-            <w:tcW w:type="dxa" w:w="864"/>
+            <w:tcW w:type="dxa" w:w="691"/>
             <w:vAlign w:val="center"/>
           </w:tcPr>
           <w:p>
@@ -184,7 +195,7 @@
         </w:tc>
         <w:tc>
           <w:tcPr>
-            <w:tcW w:type="dxa" w:w="1512"/>
+            <w:tcW w:type="dxa" w:w="1123"/>
             <w:vAlign w:val="center"/>
           </w:tcPr>
           <w:p>
@@ -195,7 +206,7 @@
         </w:tc>
         <w:tc>
           <w:tcPr>
-            <w:tcW w:type="dxa" w:w="936"/>
+            <w:tcW w:type="dxa" w:w="792"/>
             <w:vAlign w:val="center"/>
           </w:tcPr>
           <w:p>
@@ -206,8 +217,18 @@
         </w:tc>
         <w:tc>
           <w:tcPr>
-            <w:tcW w:type="dxa" w:w="1584"/>
-            <w:vAlign w:val="center"/>
+            <w:tcW w:type="dxa" w:w="1152"/>
+            <w:vAlign w:val="center"/>
+          </w:tcPr>
+          <w:p>
+            <w:r>
+              <w:t>100.00%</w:t>
+            </w:r>
+          </w:p>
+        </w:tc>
+        <w:tc>
+          <w:tcPr>
+            <w:tcW w:type="dxa" w:w="1368"/>
           </w:tcPr>
           <w:p>
             <w:r>
@@ -222,7 +243,7 @@
         </w:trPr>
         <w:tc>
           <w:tcPr>
-            <w:tcW w:type="dxa" w:w="2376"/>
+            <w:tcW w:type="dxa" w:w="2304"/>
             <w:shd w:fill="F3F6F6"/>
             <w:vAlign w:val="center"/>
           </w:tcPr>
@@ -234,7 +255,7 @@
         </w:tc>
         <w:tc>
           <w:tcPr>
-            <w:tcW w:type="dxa" w:w="1008"/>
+            <w:tcW w:type="dxa" w:w="835"/>
             <w:shd w:fill="F3F6F6"/>
             <w:vAlign w:val="center"/>
           </w:tcPr>
@@ -246,7 +267,7 @@
         </w:tc>
         <w:tc>
           <w:tcPr>
-            <w:tcW w:type="dxa" w:w="864"/>
+            <w:tcW w:type="dxa" w:w="691"/>
             <w:shd w:fill="F3F6F6"/>
             <w:vAlign w:val="center"/>
           </w:tcPr>
@@ -258,7 +279,7 @@
         </w:tc>
         <w:tc>
           <w:tcPr>
-            <w:tcW w:type="dxa" w:w="1512"/>
+            <w:tcW w:type="dxa" w:w="1123"/>
             <w:shd w:fill="F3F6F6"/>
             <w:vAlign w:val="center"/>
           </w:tcPr>
@@ -270,7 +291,7 @@
         </w:tc>
         <w:tc>
           <w:tcPr>
-            <w:tcW w:type="dxa" w:w="936"/>
+            <w:tcW w:type="dxa" w:w="792"/>
             <w:shd w:fill="F3F6F6"/>
             <w:vAlign w:val="center"/>
           </w:tcPr>
@@ -282,13 +303,23 @@
         </w:tc>
         <w:tc>
           <w:tcPr>
-            <w:tcW w:type="dxa" w:w="1584"/>
+            <w:tcW w:type="dxa" w:w="1152"/>
             <w:shd w:fill="F3F6F6"/>
             <w:vAlign w:val="center"/>
           </w:tcPr>
           <w:p>
             <w:r>
               <w:t>78.38%</w:t>
+            </w:r>
+          </w:p>
+        </w:tc>
+        <w:tc>
+          <w:tcPr>
+            <w:tcW w:type="dxa" w:w="1368"/>
+          </w:tcPr>
+          <w:p>
+            <w:r>
+              <w:t>89.19%</w:t>
             </w:r>
           </w:p>
         </w:tc>
@@ -299,7 +330,7 @@
         </w:trPr>
         <w:tc>
           <w:tcPr>
-            <w:tcW w:type="dxa" w:w="2376"/>
+            <w:tcW w:type="dxa" w:w="2304"/>
             <w:vAlign w:val="center"/>
           </w:tcPr>
           <w:p>
@@ -310,7 +341,7 @@
         </w:tc>
         <w:tc>
           <w:tcPr>
-            <w:tcW w:type="dxa" w:w="1008"/>
+            <w:tcW w:type="dxa" w:w="835"/>
             <w:vAlign w:val="center"/>
           </w:tcPr>
           <w:p>
@@ -321,7 +352,7 @@
         </w:tc>
         <w:tc>
           <w:tcPr>
-            <w:tcW w:type="dxa" w:w="864"/>
+            <w:tcW w:type="dxa" w:w="691"/>
             <w:vAlign w:val="center"/>
           </w:tcPr>
           <w:p>
@@ -332,7 +363,7 @@
         </w:tc>
         <w:tc>
           <w:tcPr>
-            <w:tcW w:type="dxa" w:w="1512"/>
+            <w:tcW w:type="dxa" w:w="1123"/>
             <w:vAlign w:val="center"/>
           </w:tcPr>
           <w:p>
@@ -343,7 +374,7 @@
         </w:tc>
         <w:tc>
           <w:tcPr>
-            <w:tcW w:type="dxa" w:w="936"/>
+            <w:tcW w:type="dxa" w:w="792"/>
             <w:vAlign w:val="center"/>
           </w:tcPr>
           <w:p>
@@ -354,12 +385,22 @@
         </w:tc>
         <w:tc>
           <w:tcPr>
-            <w:tcW w:type="dxa" w:w="1584"/>
+            <w:tcW w:type="dxa" w:w="1152"/>
             <w:vAlign w:val="center"/>
           </w:tcPr>
           <w:p>
             <w:r>
               <w:t>93.16%</w:t>
+            </w:r>
+          </w:p>
+        </w:tc>
+        <w:tc>
+          <w:tcPr>
+            <w:tcW w:type="dxa" w:w="1368"/>
+          </w:tcPr>
+          <w:p>
+            <w:r>
+              <w:t>96.58%</w:t>
             </w:r>
           </w:p>
         </w:tc>
@@ -376,7 +417,7 @@
         <w:pStyle w:val="SmallNote"/>
       </w:pPr>
       <w:r>
-        <w:t>No partial-credit weighting is used. A criterion marked Partially Met remains open. Percentages report the share of individual criteria marked Met; they are not a release-readiness rating.</w:t>
+        <w:t>Scope completion = (Met + 0.5 × Partially Met) ÷ all criteria × 100. Met = 1 point, Partially Met = 0.5 point, and Not Met = 0 points. Fully met percentage is reported separately.</w:t>
       </w:r>
     </w:p>
     <w:p>
@@ -6784,7 +6825,7 @@
     </w:p>
     <w:p>
       <w:r>
-        <w:t>109 of 117 criteria are Met (93.16%); 8 are Partially Met; 0 are Not Met. All 80 Must functional criteria are Met (100%). The eight partial criteria are Should non-functional criteria: NFR-004 AC1/AC4, NFR-006 AC1/AC2/AC3, NFR-007 AC1/AC4, and NFR-008 AC2. Recommend a controlled simulated-production demonstration on the verified HTTPS site with fictional data. Do not infer unrestricted production readiness or final team go-live approval. Close the remaining representative-user, full performance, hosted recovery/target-review, README consistency, and retention-policy items through their owners.</w:t>
+        <w:t>Weighted scope completion is 96.58%: (109 + 8 × 0.5) ÷ 117 × 100. Fully Met criteria are 109 of 117 (93.16%); 8 are Partially Met; 0 are Not Met. All 80 Must functional criteria are Met (100%). The eight partial criteria are Should non-functional criteria: NFR-004 AC1/AC4, NFR-006 AC1/AC2/AC3, NFR-007 AC1/AC4, and NFR-008 AC2. Recommend a controlled simulated-production demonstration on the verified HTTPS site with fictional data. Do not infer unrestricted production readiness or final team go-live approval. Close the remaining representative-user, full performance, hosted recovery/target-review items through their owners. The README wording correction is being handled by the team; NFR-008 AC2 remains Partial in this assessment snapshot pending the corrected artefact.</w:t>
       </w:r>
     </w:p>
     <w:p>

</xml_diff>